<commit_message>
Petition and timeline: add 2023-05-02 and 2023-08-30 minutes evidence; remove misfiled attendee page
Co-Authored-By: Claude Opus 5.5 <noreply@anthropic.com>
Claude-Session: https://claude.ai/code/session_01H9b7FFp3sXnkbpWqGcr2Bw
</commit_message>
<xml_diff>
--- a/사건타임라인.docx
+++ b/사건타임라인.docx
@@ -902,7 +902,7 @@
                 <w:sz w:val="17"/>
                 <w:szCs w:val="17"/>
               </w:rPr>
-              <w:t xml:space="preserve">2023. 5. 3.</w:t>
+              <w:t xml:space="preserve">2023. 5. 2.</w:t>
             </w:r>
           </w:p>
         </w:tc>
@@ -937,27 +937,87 @@
                 <w:sz w:val="17"/>
                 <w:szCs w:val="17"/>
               </w:rPr>
-              <w:t xml:space="preserve">순정축협, 방교리 677-6 </w:t>
-            </w:r>
-            <w:r>
-              <w:rPr>
-                <w:rFonts w:ascii="맑은 고딕" w:cs="맑은 고딕" w:eastAsia="맑은 고딕" w:hAnsi="맑은 고딕"/>
-                <w:b/>
-                <w:bCs/>
-                <w:sz w:val="17"/>
-                <w:szCs w:val="17"/>
-              </w:rPr>
-              <w:t xml:space="preserve">자원순환관련시설(퇴비사) 997.5㎡</w:t>
-            </w:r>
-            <w:r>
-              <w:rPr>
-                <w:rFonts w:ascii="맑은 고딕" w:cs="맑은 고딕" w:eastAsia="맑은 고딕" w:hAnsi="맑은 고딕"/>
-                <w:b w:val="false"/>
-                <w:bCs w:val="false"/>
-                <w:sz w:val="17"/>
-                <w:szCs w:val="17"/>
-              </w:rPr>
-              <w:t xml:space="preserve"> 신축허가 신청 (대지 8,264㎡)</w:t>
+              <w:t xml:space="preserve">제2차 위원회 회의 (</w:t>
+            </w:r>
+            <w:r>
+              <w:rPr>
+                <w:rFonts w:ascii="맑은 고딕" w:cs="맑은 고딕" w:eastAsia="맑은 고딕" w:hAnsi="맑은 고딕"/>
+                <w:b/>
+                <w:bCs/>
+                <w:sz w:val="17"/>
+                <w:szCs w:val="17"/>
+              </w:rPr>
+              <w:t xml:space="preserve">순정축협 한우명품관</w:t>
+            </w:r>
+            <w:r>
+              <w:rPr>
+                <w:rFonts w:ascii="맑은 고딕" w:cs="맑은 고딕" w:eastAsia="맑은 고딕" w:hAnsi="맑은 고딕"/>
+                <w:b w:val="false"/>
+                <w:bCs w:val="false"/>
+                <w:sz w:val="17"/>
+                <w:szCs w:val="17"/>
+              </w:rPr>
+              <w:t xml:space="preserve">, 축협 직원 3명 출석·사회). 의안 제4호: </w:t>
+            </w:r>
+            <w:r>
+              <w:rPr>
+                <w:rFonts w:ascii="맑은 고딕" w:cs="맑은 고딕" w:eastAsia="맑은 고딕" w:hAnsi="맑은 고딕"/>
+                <w:b/>
+                <w:bCs/>
+                <w:sz w:val="17"/>
+                <w:szCs w:val="17"/>
+              </w:rPr>
+              <w:t xml:space="preserve">"순정축협에서 받은 돈"을 마을별 1천만 원씩 나누자는 의견</w:t>
+            </w:r>
+            <w:r>
+              <w:rPr>
+                <w:rFonts w:ascii="맑은 고딕" w:cs="맑은 고딕" w:eastAsia="맑은 고딕" w:hAnsi="맑은 고딕"/>
+                <w:b w:val="false"/>
+                <w:bCs w:val="false"/>
+                <w:sz w:val="17"/>
+                <w:szCs w:val="17"/>
+              </w:rPr>
+              <w:t xml:space="preserve"> → 위원회 자금으로 운영 논의, 원산마을 쓰레기 처리 220만 원. 기타: 위원장·</w:t>
+            </w:r>
+            <w:r>
+              <w:rPr>
+                <w:rFonts w:ascii="맑은 고딕" w:cs="맑은 고딕" w:eastAsia="맑은 고딕" w:hAnsi="맑은 고딕"/>
+                <w:b/>
+                <w:bCs/>
+                <w:sz w:val="17"/>
+                <w:szCs w:val="17"/>
+              </w:rPr>
+              <w:t xml:space="preserve">5개 마을 이장</w:t>
+            </w:r>
+            <w:r>
+              <w:rPr>
+                <w:rFonts w:ascii="맑은 고딕" w:cs="맑은 고딕" w:eastAsia="맑은 고딕" w:hAnsi="맑은 고딕"/>
+                <w:b w:val="false"/>
+                <w:bCs w:val="false"/>
+                <w:sz w:val="17"/>
+                <w:szCs w:val="17"/>
+              </w:rPr>
+              <w:t xml:space="preserve">을 법인 임원으로, </w:t>
+            </w:r>
+            <w:r>
+              <w:rPr>
+                <w:rFonts w:ascii="맑은 고딕" w:cs="맑은 고딕" w:eastAsia="맑은 고딕" w:hAnsi="맑은 고딕"/>
+                <w:b/>
+                <w:bCs/>
+                <w:sz w:val="17"/>
+                <w:szCs w:val="17"/>
+              </w:rPr>
+              <w:t xml:space="preserve">축협 조합장을 비상근 임원으로 추천</w:t>
+            </w:r>
+            <w:r>
+              <w:rPr>
+                <w:rFonts w:ascii="맑은 고딕" w:cs="맑은 고딕" w:eastAsia="맑은 고딕" w:hAnsi="맑은 고딕"/>
+                <w:b w:val="false"/>
+                <w:bCs w:val="false"/>
+                <w:sz w:val="17"/>
+                <w:szCs w:val="17"/>
+              </w:rPr>
+              <w:t xml:space="preserve">, 전원 동의</w:t>
             </w:r>
           </w:p>
         </w:tc>
@@ -992,7 +1052,7 @@
                 <w:sz w:val="17"/>
                 <w:szCs w:val="17"/>
               </w:rPr>
-              <w:t xml:space="preserve">건축허가 신청서</w:t>
+              <w:t xml:space="preserve">제2차 위원회 회의록 (7쪽)</w:t>
             </w:r>
           </w:p>
         </w:tc>
@@ -1033,7 +1093,7 @@
                 <w:sz w:val="17"/>
                 <w:szCs w:val="17"/>
               </w:rPr>
-              <w:t xml:space="preserve">2023. 5. 12.~6. 15.</w:t>
+              <w:t xml:space="preserve">2023. 5. 3.</w:t>
             </w:r>
           </w:p>
         </w:tc>
@@ -1068,27 +1128,27 @@
                 <w:sz w:val="17"/>
                 <w:szCs w:val="17"/>
               </w:rPr>
-              <w:t xml:space="preserve">관계 부서 협의: 소방 동의(5. 12.), 축산법 거리제한 비대상·농지전용 동의 및 </w:t>
-            </w:r>
-            <w:r>
-              <w:rPr>
-                <w:rFonts w:ascii="맑은 고딕" w:cs="맑은 고딕" w:eastAsia="맑은 고딕" w:hAnsi="맑은 고딕"/>
-                <w:b/>
-                <w:bCs/>
-                <w:sz w:val="17"/>
-                <w:szCs w:val="17"/>
-              </w:rPr>
-              <w:t xml:space="preserve">농지보전부담금 100% 감면</w:t>
-            </w:r>
-            <w:r>
-              <w:rPr>
-                <w:rFonts w:ascii="맑은 고딕" w:cs="맑은 고딕" w:eastAsia="맑은 고딕" w:hAnsi="맑은 고딕"/>
-                <w:b w:val="false"/>
-                <w:bCs w:val="false"/>
-                <w:sz w:val="17"/>
-                <w:szCs w:val="17"/>
-              </w:rPr>
-              <w:t xml:space="preserve">(5. 15.), 환경정책과 "소규모환경영향평가 비대상, 가축분뇨 재활용신고 필요"(6. 15.)</w:t>
+              <w:t xml:space="preserve">순정축협, 방교리 677-6 </w:t>
+            </w:r>
+            <w:r>
+              <w:rPr>
+                <w:rFonts w:ascii="맑은 고딕" w:cs="맑은 고딕" w:eastAsia="맑은 고딕" w:hAnsi="맑은 고딕"/>
+                <w:b/>
+                <w:bCs/>
+                <w:sz w:val="17"/>
+                <w:szCs w:val="17"/>
+              </w:rPr>
+              <w:t xml:space="preserve">자원순환관련시설(퇴비사) 997.5㎡</w:t>
+            </w:r>
+            <w:r>
+              <w:rPr>
+                <w:rFonts w:ascii="맑은 고딕" w:cs="맑은 고딕" w:eastAsia="맑은 고딕" w:hAnsi="맑은 고딕"/>
+                <w:b w:val="false"/>
+                <w:bCs w:val="false"/>
+                <w:sz w:val="17"/>
+                <w:szCs w:val="17"/>
+              </w:rPr>
+              <w:t xml:space="preserve"> 신축허가 신청 (대지 8,264㎡)</w:t>
             </w:r>
           </w:p>
         </w:tc>
@@ -1123,7 +1183,7 @@
                 <w:sz w:val="17"/>
                 <w:szCs w:val="17"/>
               </w:rPr>
-              <w:t xml:space="preserve">각 부서 회신 공문</w:t>
+              <w:t xml:space="preserve">건축허가 신청서</w:t>
             </w:r>
           </w:p>
         </w:tc>
@@ -1164,7 +1224,7 @@
                 <w:sz w:val="17"/>
                 <w:szCs w:val="17"/>
               </w:rPr>
-              <w:t xml:space="preserve">2023. 7. 14.</w:t>
+              <w:t xml:space="preserve">2023. 5. 12.~6. 15.</w:t>
             </w:r>
           </w:p>
         </w:tc>
@@ -1199,7 +1259,27 @@
                 <w:sz w:val="17"/>
                 <w:szCs w:val="17"/>
               </w:rPr>
-              <w:t xml:space="preserve">건축과, 감곡면에 주민의견(민원 동향) 파악 요청</w:t>
+              <w:t xml:space="preserve">관계 부서 협의: 소방 동의(5. 12.), 축산법 거리제한 비대상·농지전용 동의 및 </w:t>
+            </w:r>
+            <w:r>
+              <w:rPr>
+                <w:rFonts w:ascii="맑은 고딕" w:cs="맑은 고딕" w:eastAsia="맑은 고딕" w:hAnsi="맑은 고딕"/>
+                <w:b/>
+                <w:bCs/>
+                <w:sz w:val="17"/>
+                <w:szCs w:val="17"/>
+              </w:rPr>
+              <w:t xml:space="preserve">농지보전부담금 100% 감면</w:t>
+            </w:r>
+            <w:r>
+              <w:rPr>
+                <w:rFonts w:ascii="맑은 고딕" w:cs="맑은 고딕" w:eastAsia="맑은 고딕" w:hAnsi="맑은 고딕"/>
+                <w:b w:val="false"/>
+                <w:bCs w:val="false"/>
+                <w:sz w:val="17"/>
+                <w:szCs w:val="17"/>
+              </w:rPr>
+              <w:t xml:space="preserve">(5. 15.), 환경정책과 "소규모환경영향평가 비대상, 가축분뇨 재활용신고 필요"(6. 15.)</w:t>
             </w:r>
           </w:p>
         </w:tc>
@@ -1234,7 +1314,7 @@
                 <w:sz w:val="17"/>
                 <w:szCs w:val="17"/>
               </w:rPr>
-              <w:t xml:space="preserve">건축과-30578</w:t>
+              <w:t xml:space="preserve">각 부서 회신 공문</w:t>
             </w:r>
           </w:p>
         </w:tc>
@@ -1275,7 +1355,7 @@
                 <w:sz w:val="17"/>
                 <w:szCs w:val="17"/>
               </w:rPr>
-              <w:t xml:space="preserve">2023. 7. 20.</w:t>
+              <w:t xml:space="preserve">2023. 7. 14.</w:t>
             </w:r>
           </w:p>
         </w:tc>
@@ -1310,27 +1390,7 @@
                 <w:sz w:val="17"/>
                 <w:szCs w:val="17"/>
               </w:rPr>
-              <w:t xml:space="preserve">주민의견서: </w:t>
-            </w:r>
-            <w:r>
-              <w:rPr>
-                <w:rFonts w:ascii="맑은 고딕" w:cs="맑은 고딕" w:eastAsia="맑은 고딕" w:hAnsi="맑은 고딕"/>
-                <w:b/>
-                <w:bCs/>
-                <w:sz w:val="17"/>
-                <w:szCs w:val="17"/>
-              </w:rPr>
-              <w:t xml:space="preserve">"반대 의견 없음"</w:t>
-            </w:r>
-            <w:r>
-              <w:rPr>
-                <w:rFonts w:ascii="맑은 고딕" w:cs="맑은 고딕" w:eastAsia="맑은 고딕" w:hAnsi="맑은 고딕"/>
-                <w:b w:val="false"/>
-                <w:bCs w:val="false"/>
-                <w:sz w:val="17"/>
-                <w:szCs w:val="17"/>
-              </w:rPr>
-              <w:t xml:space="preserve"> (의견제출인란은 공개 시 가림 처리)</w:t>
+              <w:t xml:space="preserve">건축과, 감곡면에 주민의견(민원 동향) 파악 요청</w:t>
             </w:r>
           </w:p>
         </w:tc>
@@ -1365,7 +1425,7 @@
                 <w:sz w:val="17"/>
                 <w:szCs w:val="17"/>
               </w:rPr>
-              <w:t xml:space="preserve">주민의견서</w:t>
+              <w:t xml:space="preserve">건축과-30578</w:t>
             </w:r>
           </w:p>
         </w:tc>
@@ -1406,6 +1466,137 @@
                 <w:sz w:val="17"/>
                 <w:szCs w:val="17"/>
               </w:rPr>
+              <w:t xml:space="preserve">2023. 7. 20.</w:t>
+            </w:r>
+          </w:p>
+        </w:tc>
+        <w:tc>
+          <w:tcPr>
+            <w:tcW w:type="dxa" w:w="5306"/>
+            <w:gridSpan w:val="1"/>
+            <w:tcBorders>
+              <w:top w:val="single" w:color="8C8C8C" w:sz="4"/>
+              <w:left w:val="single" w:color="8C8C8C" w:sz="4"/>
+              <w:bottom w:val="single" w:color="8C8C8C" w:sz="4"/>
+              <w:right w:val="single" w:color="8C8C8C" w:sz="4"/>
+            </w:tcBorders>
+            <w:tcMar>
+              <w:top w:type="dxa" w:w="50"/>
+              <w:left w:type="dxa" w:w="90"/>
+              <w:bottom w:type="dxa" w:w="50"/>
+              <w:right w:type="dxa" w:w="90"/>
+            </w:tcMar>
+            <w:vAlign w:val="center"/>
+          </w:tcPr>
+          <w:p>
+            <w:pPr>
+              <w:spacing w:line="270"/>
+              <w:jc w:val="left"/>
+            </w:pPr>
+            <w:r>
+              <w:rPr>
+                <w:rFonts w:ascii="맑은 고딕" w:cs="맑은 고딕" w:eastAsia="맑은 고딕" w:hAnsi="맑은 고딕"/>
+                <w:b w:val="false"/>
+                <w:bCs w:val="false"/>
+                <w:sz w:val="17"/>
+                <w:szCs w:val="17"/>
+              </w:rPr>
+              <w:t xml:space="preserve">주민의견서: </w:t>
+            </w:r>
+            <w:r>
+              <w:rPr>
+                <w:rFonts w:ascii="맑은 고딕" w:cs="맑은 고딕" w:eastAsia="맑은 고딕" w:hAnsi="맑은 고딕"/>
+                <w:b/>
+                <w:bCs/>
+                <w:sz w:val="17"/>
+                <w:szCs w:val="17"/>
+              </w:rPr>
+              <w:t xml:space="preserve">"반대 의견 없음"</w:t>
+            </w:r>
+            <w:r>
+              <w:rPr>
+                <w:rFonts w:ascii="맑은 고딕" w:cs="맑은 고딕" w:eastAsia="맑은 고딕" w:hAnsi="맑은 고딕"/>
+                <w:b w:val="false"/>
+                <w:bCs w:val="false"/>
+                <w:sz w:val="17"/>
+                <w:szCs w:val="17"/>
+              </w:rPr>
+              <w:t xml:space="preserve"> (의견제출인란은 공개 시 가림 처리)</w:t>
+            </w:r>
+          </w:p>
+        </w:tc>
+        <w:tc>
+          <w:tcPr>
+            <w:tcW w:type="dxa" w:w="3100"/>
+            <w:gridSpan w:val="1"/>
+            <w:tcBorders>
+              <w:top w:val="single" w:color="8C8C8C" w:sz="4"/>
+              <w:left w:val="single" w:color="8C8C8C" w:sz="4"/>
+              <w:bottom w:val="single" w:color="8C8C8C" w:sz="4"/>
+              <w:right w:val="single" w:color="8C8C8C" w:sz="4"/>
+            </w:tcBorders>
+            <w:tcMar>
+              <w:top w:type="dxa" w:w="50"/>
+              <w:left w:type="dxa" w:w="90"/>
+              <w:bottom w:type="dxa" w:w="50"/>
+              <w:right w:type="dxa" w:w="90"/>
+            </w:tcMar>
+            <w:vAlign w:val="center"/>
+          </w:tcPr>
+          <w:p>
+            <w:pPr>
+              <w:spacing w:line="270"/>
+              <w:jc w:val="left"/>
+            </w:pPr>
+            <w:r>
+              <w:rPr>
+                <w:rFonts w:ascii="맑은 고딕" w:cs="맑은 고딕" w:eastAsia="맑은 고딕" w:hAnsi="맑은 고딕"/>
+                <w:b w:val="false"/>
+                <w:bCs w:val="false"/>
+                <w:sz w:val="17"/>
+                <w:szCs w:val="17"/>
+              </w:rPr>
+              <w:t xml:space="preserve">주민의견서</w:t>
+            </w:r>
+          </w:p>
+        </w:tc>
+      </w:tr>
+      <w:tr>
+        <w:trPr>
+          <w:cantSplit/>
+          <w:tblHeader w:val="off"/>
+        </w:trPr>
+        <w:tc>
+          <w:tcPr>
+            <w:tcW w:type="dxa" w:w="1500"/>
+            <w:gridSpan w:val="1"/>
+            <w:tcBorders>
+              <w:top w:val="single" w:color="8C8C8C" w:sz="4"/>
+              <w:left w:val="single" w:color="8C8C8C" w:sz="4"/>
+              <w:bottom w:val="single" w:color="8C8C8C" w:sz="4"/>
+              <w:right w:val="single" w:color="8C8C8C" w:sz="4"/>
+            </w:tcBorders>
+            <w:tcMar>
+              <w:top w:type="dxa" w:w="50"/>
+              <w:left w:type="dxa" w:w="90"/>
+              <w:bottom w:type="dxa" w:w="50"/>
+              <w:right w:type="dxa" w:w="90"/>
+            </w:tcMar>
+            <w:vAlign w:val="center"/>
+          </w:tcPr>
+          <w:p>
+            <w:pPr>
+              <w:spacing w:line="270"/>
+              <w:jc w:val="left"/>
+            </w:pPr>
+            <w:r>
+              <w:rPr>
+                <w:rFonts w:ascii="맑은 고딕" w:cs="맑은 고딕" w:eastAsia="맑은 고딕" w:hAnsi="맑은 고딕"/>
+                <w:b/>
+                <w:bCs/>
+                <w:sz w:val="17"/>
+                <w:szCs w:val="17"/>
+              </w:rPr>
               <w:t xml:space="preserve">2023. 7. 21.</w:t>
             </w:r>
           </w:p>
@@ -1477,6 +1668,197 @@
                 <w:szCs w:val="17"/>
               </w:rPr>
               <w:t xml:space="preserve">감곡면-10069</w:t>
+            </w:r>
+          </w:p>
+        </w:tc>
+      </w:tr>
+      <w:tr>
+        <w:trPr>
+          <w:cantSplit/>
+          <w:tblHeader w:val="off"/>
+        </w:trPr>
+        <w:tc>
+          <w:tcPr>
+            <w:tcW w:type="dxa" w:w="1500"/>
+            <w:gridSpan w:val="1"/>
+            <w:tcBorders>
+              <w:top w:val="single" w:color="8C8C8C" w:sz="4"/>
+              <w:left w:val="single" w:color="8C8C8C" w:sz="4"/>
+              <w:bottom w:val="single" w:color="8C8C8C" w:sz="4"/>
+              <w:right w:val="single" w:color="8C8C8C" w:sz="4"/>
+            </w:tcBorders>
+            <w:tcMar>
+              <w:top w:type="dxa" w:w="50"/>
+              <w:left w:type="dxa" w:w="90"/>
+              <w:bottom w:type="dxa" w:w="50"/>
+              <w:right w:type="dxa" w:w="90"/>
+            </w:tcMar>
+            <w:vAlign w:val="center"/>
+          </w:tcPr>
+          <w:p>
+            <w:pPr>
+              <w:spacing w:line="270"/>
+              <w:jc w:val="left"/>
+            </w:pPr>
+            <w:r>
+              <w:rPr>
+                <w:rFonts w:ascii="맑은 고딕" w:cs="맑은 고딕" w:eastAsia="맑은 고딕" w:hAnsi="맑은 고딕"/>
+                <w:b/>
+                <w:bCs/>
+                <w:sz w:val="17"/>
+                <w:szCs w:val="17"/>
+              </w:rPr>
+              <w:t xml:space="preserve">2023. 8. 30.</w:t>
+            </w:r>
+          </w:p>
+        </w:tc>
+        <w:tc>
+          <w:tcPr>
+            <w:tcW w:type="dxa" w:w="5306"/>
+            <w:gridSpan w:val="1"/>
+            <w:tcBorders>
+              <w:top w:val="single" w:color="8C8C8C" w:sz="4"/>
+              <w:left w:val="single" w:color="8C8C8C" w:sz="4"/>
+              <w:bottom w:val="single" w:color="8C8C8C" w:sz="4"/>
+              <w:right w:val="single" w:color="8C8C8C" w:sz="4"/>
+            </w:tcBorders>
+            <w:tcMar>
+              <w:top w:type="dxa" w:w="50"/>
+              <w:left w:type="dxa" w:w="90"/>
+              <w:bottom w:type="dxa" w:w="50"/>
+              <w:right w:type="dxa" w:w="90"/>
+            </w:tcMar>
+            <w:vAlign w:val="center"/>
+          </w:tcPr>
+          <w:p>
+            <w:pPr>
+              <w:spacing w:line="270"/>
+              <w:jc w:val="left"/>
+            </w:pPr>
+            <w:r>
+              <w:rPr>
+                <w:rFonts w:ascii="맑은 고딕" w:cs="맑은 고딕" w:eastAsia="맑은 고딕" w:hAnsi="맑은 고딕"/>
+                <w:b w:val="false"/>
+                <w:bCs w:val="false"/>
+                <w:sz w:val="17"/>
+                <w:szCs w:val="17"/>
+              </w:rPr>
+              <w:t xml:space="preserve">"</w:t>
+            </w:r>
+            <w:r>
+              <w:rPr>
+                <w:rFonts w:ascii="맑은 고딕" w:cs="맑은 고딕" w:eastAsia="맑은 고딕" w:hAnsi="맑은 고딕"/>
+                <w:b/>
+                <w:bCs/>
+                <w:sz w:val="17"/>
+                <w:szCs w:val="17"/>
+              </w:rPr>
+              <w:t xml:space="preserve">감곡면 5개권역 환경개선위원회</w:t>
+            </w:r>
+            <w:r>
+              <w:rPr>
+                <w:rFonts w:ascii="맑은 고딕" w:cs="맑은 고딕" w:eastAsia="맑은 고딕" w:hAnsi="맑은 고딕"/>
+                <w:b w:val="false"/>
+                <w:bCs w:val="false"/>
+                <w:sz w:val="17"/>
+                <w:szCs w:val="17"/>
+              </w:rPr>
+              <w:t xml:space="preserve">(4차)" 회의 (마을기업 자연가 사무실). 송완복을 </w:t>
+            </w:r>
+            <w:r>
+              <w:rPr>
+                <w:rFonts w:ascii="맑은 고딕" w:cs="맑은 고딕" w:eastAsia="맑은 고딕" w:hAnsi="맑은 고딕"/>
+                <w:b/>
+                <w:bCs/>
+                <w:sz w:val="17"/>
+                <w:szCs w:val="17"/>
+              </w:rPr>
+              <w:t xml:space="preserve">"5개권역마을을 대표"하는 촌장</w:t>
+            </w:r>
+            <w:r>
+              <w:rPr>
+                <w:rFonts w:ascii="맑은 고딕" w:cs="맑은 고딕" w:eastAsia="맑은 고딕" w:hAnsi="맑은 고딕"/>
+                <w:b w:val="false"/>
+                <w:bCs w:val="false"/>
+                <w:sz w:val="17"/>
+                <w:szCs w:val="17"/>
+              </w:rPr>
+              <w:t xml:space="preserve">으로 선출·위원 위촉. 면민의 날 행사에 </w:t>
+            </w:r>
+            <w:r>
+              <w:rPr>
+                <w:rFonts w:ascii="맑은 고딕" w:cs="맑은 고딕" w:eastAsia="맑은 고딕" w:hAnsi="맑은 고딕"/>
+                <w:b/>
+                <w:bCs/>
+                <w:sz w:val="17"/>
+                <w:szCs w:val="17"/>
+              </w:rPr>
+              <w:t xml:space="preserve">위원회 자금</w:t>
+            </w:r>
+            <w:r>
+              <w:rPr>
+                <w:rFonts w:ascii="맑은 고딕" w:cs="맑은 고딕" w:eastAsia="맑은 고딕" w:hAnsi="맑은 고딕"/>
+                <w:b w:val="false"/>
+                <w:bCs w:val="false"/>
+                <w:sz w:val="17"/>
+                <w:szCs w:val="17"/>
+              </w:rPr>
+              <w:t xml:space="preserve"> 사용 결의. 퇴비는 축협 자원화센터 지원, 가공센터는 </w:t>
+            </w:r>
+            <w:r>
+              <w:rPr>
+                <w:rFonts w:ascii="맑은 고딕" w:cs="맑은 고딕" w:eastAsia="맑은 고딕" w:hAnsi="맑은 고딕"/>
+                <w:b/>
+                <w:bCs/>
+                <w:sz w:val="17"/>
+                <w:szCs w:val="17"/>
+              </w:rPr>
+              <w:t xml:space="preserve">축협 자원화시설 현대화 시 지원</w:t>
+            </w:r>
+            <w:r>
+              <w:rPr>
+                <w:rFonts w:ascii="맑은 고딕" w:cs="맑은 고딕" w:eastAsia="맑은 고딕" w:hAnsi="맑은 고딕"/>
+                <w:b w:val="false"/>
+                <w:bCs w:val="false"/>
+                <w:sz w:val="17"/>
+                <w:szCs w:val="17"/>
+              </w:rPr>
+              <w:t xml:space="preserve"> 요청</w:t>
+            </w:r>
+          </w:p>
+        </w:tc>
+        <w:tc>
+          <w:tcPr>
+            <w:tcW w:type="dxa" w:w="3100"/>
+            <w:gridSpan w:val="1"/>
+            <w:tcBorders>
+              <w:top w:val="single" w:color="8C8C8C" w:sz="4"/>
+              <w:left w:val="single" w:color="8C8C8C" w:sz="4"/>
+              <w:bottom w:val="single" w:color="8C8C8C" w:sz="4"/>
+              <w:right w:val="single" w:color="8C8C8C" w:sz="4"/>
+            </w:tcBorders>
+            <w:tcMar>
+              <w:top w:type="dxa" w:w="50"/>
+              <w:left w:type="dxa" w:w="90"/>
+              <w:bottom w:type="dxa" w:w="50"/>
+              <w:right w:type="dxa" w:w="90"/>
+            </w:tcMar>
+            <w:vAlign w:val="center"/>
+          </w:tcPr>
+          <w:p>
+            <w:pPr>
+              <w:spacing w:line="270"/>
+              <w:jc w:val="left"/>
+            </w:pPr>
+            <w:r>
+              <w:rPr>
+                <w:rFonts w:ascii="맑은 고딕" w:cs="맑은 고딕" w:eastAsia="맑은 고딕" w:hAnsi="맑은 고딕"/>
+                <w:b w:val="false"/>
+                <w:bCs w:val="false"/>
+                <w:sz w:val="17"/>
+                <w:szCs w:val="17"/>
+              </w:rPr>
+              <w:t xml:space="preserve">5개권역 위원회 회의록</w:t>
             </w:r>
           </w:p>
         </w:tc>
@@ -2765,7 +3147,7 @@
           <w:sz w:val="18"/>
           <w:szCs w:val="18"/>
         </w:rPr>
-        <w:t xml:space="preserve">주민의견 수렴의 순서</w:t>
+        <w:t xml:space="preserve">금원 수령과 인허가의 순서</w:t>
       </w:r>
       <w:r>
         <w:rPr>
@@ -2773,7 +3155,95 @@
           <w:sz w:val="18"/>
           <w:szCs w:val="18"/>
         </w:rPr>
-        <w:t xml:space="preserve">: 후원 약속(1. 17.)과 협약(1. 30.) 뒤에 "반대 의견 없음"(7. 20.)이 제출되었다. 의견제출인은 공개본에서 가려져 있다.</w:t>
+        <w:t xml:space="preserve">: 회의록상 </w:t>
+      </w:r>
+      <w:r>
+        <w:rPr>
+          <w:rFonts w:ascii="맑은 고딕" w:cs="맑은 고딕" w:eastAsia="맑은 고딕" w:hAnsi="맑은 고딕"/>
+          <w:b/>
+          <w:bCs/>
+          <w:sz w:val="18"/>
+          <w:szCs w:val="18"/>
+        </w:rPr>
+        <w:t xml:space="preserve">5. 2. 이전에 이미 금원 수령</w:t>
+      </w:r>
+      <w:r>
+        <w:rPr>
+          <w:rFonts w:ascii="맑은 고딕" w:cs="맑은 고딕" w:eastAsia="맑은 고딕" w:hAnsi="맑은 고딕"/>
+          <w:sz w:val="18"/>
+          <w:szCs w:val="18"/>
+        </w:rPr>
+        <w:t xml:space="preserve"> → 5. 3. 허가 신청 → 7. 20. "반대 의견 없음" → 9. 21. 허가. 의견제출인은 공개본에서 가려져 있다.</w:t>
+      </w:r>
+    </w:p>
+    <w:p>
+      <w:pPr>
+        <w:spacing w:after="60" w:line="290"/>
+        <w:ind w:left="400" w:hanging="400"/>
+      </w:pPr>
+      <w:r>
+        <w:rPr>
+          <w:rFonts w:ascii="맑은 고딕" w:cs="맑은 고딕" w:eastAsia="맑은 고딕" w:hAnsi="맑은 고딕"/>
+          <w:b/>
+          <w:bCs/>
+          <w:sz w:val="18"/>
+          <w:szCs w:val="18"/>
+        </w:rPr>
+        <w:t xml:space="preserve">⑤ </w:t>
+      </w:r>
+      <w:r>
+        <w:rPr>
+          <w:rFonts w:ascii="맑은 고딕" w:cs="맑은 고딕" w:eastAsia="맑은 고딕" w:hAnsi="맑은 고딕"/>
+          <w:b/>
+          <w:bCs/>
+          <w:sz w:val="18"/>
+          <w:szCs w:val="18"/>
+        </w:rPr>
+        <w:t xml:space="preserve">독립성 결여</w:t>
+      </w:r>
+      <w:r>
+        <w:rPr>
+          <w:rFonts w:ascii="맑은 고딕" w:cs="맑은 고딕" w:eastAsia="맑은 고딕" w:hAnsi="맑은 고딕"/>
+          <w:sz w:val="18"/>
+          <w:szCs w:val="18"/>
+        </w:rPr>
+        <w:t xml:space="preserve">: 위원회는 축협 시설에서 축협 직원 사회로 회의를 열고, </w:t>
+      </w:r>
+      <w:r>
+        <w:rPr>
+          <w:rFonts w:ascii="맑은 고딕" w:cs="맑은 고딕" w:eastAsia="맑은 고딕" w:hAnsi="맑은 고딕"/>
+          <w:b/>
+          <w:bCs/>
+          <w:sz w:val="18"/>
+          <w:szCs w:val="18"/>
+        </w:rPr>
+        <w:t xml:space="preserve">축협 조합장을 위원회 임원으로 추천</w:t>
+      </w:r>
+      <w:r>
+        <w:rPr>
+          <w:rFonts w:ascii="맑은 고딕" w:cs="맑은 고딕" w:eastAsia="맑은 고딕" w:hAnsi="맑은 고딕"/>
+          <w:sz w:val="18"/>
+          <w:szCs w:val="18"/>
+        </w:rPr>
+        <w:t xml:space="preserve">하였다. 1억 원 출처로 지목된 송완복은 </w:t>
+      </w:r>
+      <w:r>
+        <w:rPr>
+          <w:rFonts w:ascii="맑은 고딕" w:cs="맑은 고딕" w:eastAsia="맑은 고딕" w:hAnsi="맑은 고딕"/>
+          <w:b/>
+          <w:bCs/>
+          <w:sz w:val="18"/>
+          <w:szCs w:val="18"/>
+        </w:rPr>
+        <w:t xml:space="preserve">5개권역 대표 촌장 겸 위원</w:t>
+      </w:r>
+      <w:r>
+        <w:rPr>
+          <w:rFonts w:ascii="맑은 고딕" w:cs="맑은 고딕" w:eastAsia="맑은 고딕" w:hAnsi="맑은 고딕"/>
+          <w:sz w:val="18"/>
+          <w:szCs w:val="18"/>
+        </w:rPr>
+        <w:t xml:space="preserve">이 되었다.</w:t>
       </w:r>
     </w:p>
     <w:p>
@@ -2870,7 +3340,7 @@
           <w:sz w:val="18"/>
           <w:szCs w:val="18"/>
         </w:rPr>
-        <w:t xml:space="preserve">1억 원 지급일과 7. 20. 의견서의 선후 관계  ·  의견제출인 성명(가림 해제 또는 이의신청)  ·  분기별 검사자료 보고 여부  ·  가축분뇨 재활용신고 및 2024년 이후 민원·측정 내역</w:t>
+        <w:t xml:space="preserve">1억 원의 정확한 지급일(5. 2. 이전)  ·  의견제출인 성명(가림 해제 또는 이의신청)  ·  위원회 법인 등록 및 조합장 임원 취임 여부  ·  분기별 검사자료 보고 여부  ·  가축분뇨 재활용신고 및 2024년 이후 민원·측정 내역</w:t>
       </w:r>
     </w:p>
     <w:sectPr>

</xml_diff>